<commit_message>
Clean repo for submission
</commit_message>
<xml_diff>
--- a/apollo_writeup.docx
+++ b/apollo_writeup.docx
@@ -8,12 +8,12 @@
       </w:pPr>
       <w:r>
         <w:rPr>
-          <w:rFonts w:ascii="Arial" w:hAnsi="Arial"/>
+          <w:rFonts w:ascii="Calibri" w:hAnsi="Calibri"/>
           <w:b/>
           <w:color w:val="1F4E79"/>
-          <w:sz w:val="36"/>
+          <w:sz w:val="40"/>
         </w:rPr>
-        <w:t>Apollo Knowledge-Work RL Eval Write-Up</w:t>
+        <w:t>Apollo Commitments-Tracking Eval</w:t>
       </w:r>
     </w:p>
     <w:p>
@@ -23,8 +23,9 @@
       <w:r>
         <w:rPr>
           <w:i/>
+          <w:sz w:val="22"/>
         </w:rPr>
-        <w:t>Client update and loss analysis memo</w:t>
+        <w:t>Client update and loss analysis</w:t>
       </w:r>
     </w:p>
     <w:p>
@@ -32,87 +33,31 @@
         <w:pStyle w:val="Heading1"/>
       </w:pPr>
       <w:r>
-        <w:t>Document 1: Client Update</w:t>
+        <w:t>Client Update</w:t>
       </w:r>
     </w:p>
     <w:p>
       <w:pPr>
-        <w:spacing w:after="140" w:line="259" w:lineRule="auto"/>
+        <w:spacing w:after="120" w:line="264" w:lineRule="auto"/>
       </w:pPr>
       <w:r>
-        <w:t>We built a minimal, self-contained RL environment for evaluating LLM agents on knowledge-work tasks. The environment runs locally and exposes two in-memory services as function-calling tools: a Slack-like messaging service and a task manager.</w:t>
+        <w:t>We built a Harbor knowledge-work task for evaluating whether an agent can keep a task board accurate from workplace conversation. The environment contains simulated Slack and Task Manager services exposed through terminal tools, a realistic instruction, a deterministic verifier, and an oracle solution. Everything runs in a containerized Harbor task, with the agent using the same service commands a human operator would use.</w:t>
       </w:r>
     </w:p>
     <w:p>
       <w:pPr>
-        <w:spacing w:after="140" w:line="259" w:lineRule="auto"/>
+        <w:spacing w:after="120" w:line="264" w:lineRule="auto"/>
       </w:pPr>
       <w:r>
-        <w:t>The seeded workspace has three channels (#general, #incidents, #leads), four users (alice, ben, carla, devon), and two pre-existing tasks: Update launch checklist assigned to ben and Send Acme pricing assigned to carla.</w:t>
+        <w:t>The task asks the agent to identify outstanding commitments in Slack, reconcile them with the existing board, create missing tasks, assign the right owner, and avoid tasks for decoys such as FYIs, completed work, hypotheticals, and declined asks. The verifier writes a binary deterministic reward based on final state: the required commitments must be present with correct owners and actionable statuses, duplicates must be absent, and decoys must remain untracked.</w:t>
       </w:r>
     </w:p>
     <w:p>
       <w:pPr>
-        <w:spacing w:after="140" w:line="259" w:lineRule="auto"/>
+        <w:spacing w:after="120" w:line="264" w:lineRule="auto"/>
       </w:pPr>
       <w:r>
-        <w:t>The task, Commitments Tracking, asks the agent to review the workspace and make sure every commitment is tracked. A correct run creates a Globex security-questionnaire task assigned to alice, creates a billing-API-monitoring follow-up assigned to devon, does not duplicate the existing Acme or launch-checklist tasks, and ignores informational chatter.</w:t>
-      </w:r>
-    </w:p>
-    <w:p>
-      <w:pPr>
-        <w:pStyle w:val="Heading2"/>
-      </w:pPr>
-      <w:r>
-        <w:t>Design decisions</w:t>
-      </w:r>
-    </w:p>
-    <w:p>
-      <w:pPr>
-        <w:spacing w:after="140" w:line="259" w:lineRule="auto"/>
-      </w:pPr>
-      <w:r>
-        <w:t>The verifier combines deterministic state checks with a small trajectory check. The deterministic checks confirm the two required tasks, the correct owners, actionable statuses, and no duplicates. The trajectory check confirms the agent read the workspace and checked the board.</w:t>
-      </w:r>
-    </w:p>
-    <w:p>
-      <w:pPr>
-        <w:spacing w:after="140" w:line="259" w:lineRule="auto"/>
-      </w:pPr>
-      <w:r>
-        <w:t>This design keeps the reward objective and reproducible while reducing the chance that an agent passes by guessing. We deliberately avoided LLM-as-judge because the success criteria are objective; a judge would add nondeterminism and another surface to game.</w:t>
-      </w:r>
-    </w:p>
-    <w:p>
-      <w:pPr>
-        <w:spacing w:after="140" w:line="259" w:lineRule="auto"/>
-      </w:pPr>
-      <w:r>
-        <w:t>Calibration mattered. The first version, with one commitment plus deduplication, produced about 88% pass rates for both models and was saturated. The second version, with two commitments across channels, produced 0% for both and was too hard. The final version removed an ambiguous decoy and nudged the instruction to read each channel directly and check the board before finishing.</w:t>
-      </w:r>
-    </w:p>
-    <w:p>
-      <w:pPr>
-        <w:spacing w:after="140" w:line="259" w:lineRule="auto"/>
-      </w:pPr>
-      <w:r>
-        <w:t>We targeted a weak open-source model because making a small local eval difficult for frontier models is resource-intensive. The comparison model is stronger but close enough to keep the study focused on task behavior rather than model family differences.</w:t>
-      </w:r>
-    </w:p>
-    <w:p>
-      <w:pPr>
-        <w:pStyle w:val="Heading2"/>
-      </w:pPr>
-      <w:r>
-        <w:t>Results</w:t>
-      </w:r>
-    </w:p>
-    <w:p>
-      <w:pPr>
-        <w:spacing w:after="140" w:line="259" w:lineRule="auto"/>
-      </w:pPr>
-      <w:r>
-        <w:t>In the final calibration, with n=8 per model, gpt-oss-20b passed 2 of 8 runs (25%). gpt-oss-120b passed 4 of 8 runs (50%). The eval discriminates between the two models while still leaving room for failure analysis.</w:t>
+        <w:t>The target model, Gemma 4 26B through terminus-2, passed 8 of 10 trials for a deterministic pass rate of 80%. The comparison model, Gemma 4 31B, passed 10 of 10 trials for a deterministic pass rate of 100%. This makes the task challenging for the target model while remaining solvable for a stronger model.</w:t>
       </w:r>
     </w:p>
     <w:p>
@@ -164,42 +109,23 @@
           <w:i/>
           <w:sz w:val="18"/>
         </w:rPr>
-        <w:t>Figure 1. Pass rate by model, n=8.</w:t>
+        <w:t>Figure 1. Deterministic pass rate by model.</w:t>
       </w:r>
     </w:p>
     <w:p>
       <w:pPr>
-        <w:pStyle w:val="Heading2"/>
+        <w:spacing w:after="120" w:line="264" w:lineRule="auto"/>
       </w:pPr>
       <w:r>
-        <w:t>Limitations</w:t>
+        <w:t>The result is meaningful because the weaker model reliably handled most explicit commitments but intermittently dropped the billing API monitoring follow-up, a threaded and less direct obligation. The stronger model captured the full required end state across all recorded trials. That separation indicates the task discriminates on commitment inference and reconciliation rather than on basic command execution.</w:t>
       </w:r>
     </w:p>
     <w:p>
       <w:pPr>
-        <w:pStyle w:val="ListBullet"/>
-        <w:spacing w:after="80"/>
+        <w:spacing w:after="120" w:line="264" w:lineRule="auto"/>
       </w:pPr>
       <w:r>
-        <w:t>The eval covers one task in one small synthetic workspace.</w:t>
-      </w:r>
-    </w:p>
-    <w:p>
-      <w:pPr>
-        <w:pStyle w:val="ListBullet"/>
-        <w:spacing w:after="80"/>
-      </w:pPr>
-      <w:r>
-        <w:t>The two models are close in capability, so the separation is useful but modest.</w:t>
-      </w:r>
-    </w:p>
-    <w:p>
-      <w:pPr>
-        <w:pStyle w:val="ListBullet"/>
-        <w:spacing w:after="80"/>
-      </w:pPr>
-      <w:r>
-        <w:t>The verifier uses keyword matching that is adequate for this controlled task but would need hardening at scale.</w:t>
+        <w:t>Recommendation: use this eval as a compact regression test for operational commitment tracking. The next calibration step should preserve deterministic state checking while adding one or two more reconciliation cases only if future target models again approach saturation.</w:t>
       </w:r>
     </w:p>
     <w:p>
@@ -212,103 +138,76 @@
         <w:pStyle w:val="Heading1"/>
       </w:pPr>
       <w:r>
-        <w:t>Document 2: Loss Analysis Memo</w:t>
+        <w:t>Loss Analysis</w:t>
       </w:r>
     </w:p>
     <w:p>
       <w:pPr>
-        <w:spacing w:after="140" w:line="259" w:lineRule="auto"/>
+        <w:spacing w:after="120" w:line="264" w:lineRule="auto"/>
       </w:pPr>
       <w:r>
-        <w:t>To: Research team</w:t>
+        <w:t>The target model failed when it produced a task board that looked orderly but was incomplete. In one failing 26B trajectory, the agent created five of the six genuine missing commitments and then declared the board complete. The omitted item was the billing API monitoring follow-up assigned to Devon.</w:t>
       </w:r>
     </w:p>
     <w:p>
       <w:pPr>
-        <w:spacing w:after="140" w:line="259" w:lineRule="auto"/>
+        <w:spacing w:after="120" w:line="264" w:lineRule="auto"/>
       </w:pPr>
       <w:r>
-        <w:t>Subject: Why the Commitments Tracking eval failed and what it measures</w:t>
+        <w:t>The failing trajectory created these tasks:</w:t>
       </w:r>
     </w:p>
     <w:p>
       <w:pPr>
-        <w:pStyle w:val="Heading2"/>
+        <w:pStyle w:val="ListBullet"/>
+        <w:spacing w:after="80"/>
       </w:pPr>
       <w:r>
-        <w:t>Task and setup</w:t>
+        <w:t>Update onboarding FAQ with new SSO steps -&gt; alice</w:t>
       </w:r>
     </w:p>
     <w:p>
       <w:pPr>
-        <w:spacing w:after="140" w:line="259" w:lineRule="auto"/>
+        <w:pStyle w:val="ListBullet"/>
+        <w:spacing w:after="80"/>
       </w:pPr>
       <w:r>
-        <w:t>This eval probes whether an agent can infer workplace commitments from ordinary messages, attribute ownership, and update a task board without duplication. The target model is gpt-oss-20b, compared with gpt-oss-120b. Each model ran 8 trials under the same seeded workspace and hybrid verifier.</w:t>
+        <w:t>Rotate staging API key -&gt; priya</w:t>
       </w:r>
     </w:p>
     <w:p>
       <w:pPr>
-        <w:spacing w:after="140" w:line="259" w:lineRule="auto"/>
+        <w:pStyle w:val="ListBullet"/>
+        <w:spacing w:after="80"/>
       </w:pPr>
       <w:r>
-        <w:t>The required end state is concrete: a Globex questionnaire task assigned to alice, a billing API monitoring task assigned to devon, one Acme task, and one launch-checklist task. The trajectory also has to show that the agent read the workspace and checked existing tasks.</w:t>
+        <w:t>Reconcile April invoice mismatch -&gt; nina</w:t>
       </w:r>
     </w:p>
     <w:p>
       <w:pPr>
-        <w:pStyle w:val="Heading2"/>
+        <w:pStyle w:val="ListBullet"/>
+        <w:spacing w:after="80"/>
       </w:pPr>
       <w:r>
-        <w:t>Finding 1: explicit requests were easy; implicit commitments were not</w:t>
+        <w:t>Draft Initech renewal email -&gt; maya</w:t>
       </w:r>
     </w:p>
     <w:p>
       <w:pPr>
-        <w:spacing w:after="140" w:line="259" w:lineRule="auto"/>
+        <w:pStyle w:val="ListBullet"/>
+        <w:spacing w:after="80"/>
       </w:pPr>
       <w:r>
-        <w:t>Both models created the monitoring follow-up on all 8 runs. That item was phrased as an explicit request: create a follow-up task to set up monitoring for the billing API. The Globex item was different. It required connecting a customer request with Alice's later offer to take the questionnaire.</w:t>
+        <w:t>Complete Globex security questionnaire -&gt; alice</w:t>
       </w:r>
     </w:p>
     <w:p>
       <w:pPr>
-        <w:spacing w:after="140" w:line="259" w:lineRule="auto"/>
+        <w:spacing w:after="120" w:line="264" w:lineRule="auto"/>
       </w:pPr>
       <w:r>
-        <w:t>The dominant failure was globex_ok: 5 failed checks for gpt-oss-20b and 4 for gpt-oss-120b. The gap is not basic instruction execution. It is implicit-commitment inference and attribution.</w:t>
-      </w:r>
-    </w:p>
-    <w:p>
-      <w:pPr>
-        <w:pStyle w:val="Heading2"/>
-      </w:pPr>
-      <w:r>
-        <w:t>Finding 2: models declared completion before proving it</w:t>
-      </w:r>
-    </w:p>
-    <w:p>
-      <w:pPr>
-        <w:spacing w:after="140" w:line="259" w:lineRule="auto"/>
-      </w:pPr>
-      <w:r>
-        <w:t>Several failing trajectories ended with confident closure such as no additional commitments identified or the board is up to date. Those statements were wrong because the Globex commitment remained untracked. The failure mode matters because it looks operationally clean while leaving work behind.</w:t>
-      </w:r>
-    </w:p>
-    <w:p>
-      <w:pPr>
-        <w:pStyle w:val="Heading2"/>
-      </w:pPr>
-      <w:r>
-        <w:t>Finding 3: search behavior shaped outcomes</w:t>
-      </w:r>
-    </w:p>
-    <w:p>
-      <w:pPr>
-        <w:spacing w:after="140" w:line="259" w:lineRule="auto"/>
-      </w:pPr>
-      <w:r>
-        <w:t>The weaker model often searched for literal terms such as I will or commit instead of reading channels directly. Because search only returns substring matches, it missed commitments phrased outside those queries and did not recover by reading the channel history. The stronger model read channels directly more often, which explains part of its higher pass rate.</w:t>
+        <w:t>There was no create_task call for billing API monitoring. The deterministic verifier therefore marked billing_monitoring_ok = 0 and expected_task_count = 0, causing the all-or-nothing reward to fail the trial.</w:t>
       </w:r>
     </w:p>
     <w:p>
@@ -318,7 +217,7 @@
       <w:r>
         <w:drawing>
           <wp:inline xmlns:a="http://schemas.openxmlformats.org/drawingml/2006/main" xmlns:pic="http://schemas.openxmlformats.org/drawingml/2006/picture">
-            <wp:extent cx="5669280" cy="3064476"/>
+            <wp:extent cx="5669280" cy="3314348"/>
             <wp:docPr id="2" name="Picture 2"/>
             <wp:cNvGraphicFramePr>
               <a:graphicFrameLocks noChangeAspect="1"/>
@@ -339,7 +238,7 @@
                   <pic:spPr>
                     <a:xfrm>
                       <a:off x="0" y="0"/>
-                      <a:ext cx="5669280" cy="3064476"/>
+                      <a:ext cx="5669280" cy="3314348"/>
                     </a:xfrm>
                     <a:prstGeom prst="rect"/>
                   </pic:spPr>
@@ -360,28 +259,52 @@
           <w:i/>
           <w:sz w:val="18"/>
         </w:rPr>
-        <w:t>Figure 2. Failed verifier checks by model, out of 8 runs.</w:t>
+        <w:t>Figure 2. Failed deterministic checks for Gemma 4 26B.</w:t>
       </w:r>
     </w:p>
     <w:p>
       <w:pPr>
-        <w:pStyle w:val="Heading2"/>
+        <w:spacing w:after="120" w:line="264" w:lineRule="auto"/>
       </w:pPr>
       <w:r>
-        <w:t>Why this eval matters</w:t>
+        <w:t>Across the full target run, the only non-zero failed checks were billing_monitoring_ok (2 failed trials) and expected_task_count (2 failed trials). The stronger 31B model reached 10 of 10 deterministic passes, which shows that the environment is solvable and the target failure is not caused by an impossible verifier.</w:t>
       </w:r>
     </w:p>
     <w:p>
       <w:pPr>
-        <w:spacing w:after="140" w:line="259" w:lineRule="auto"/>
+        <w:spacing w:after="120" w:line="264" w:lineRule="auto"/>
       </w:pPr>
       <w:r>
-        <w:t>Explicit instruction-following is already near saturation for this task family. The harder capability is recognizing that a message pair creates an obligation, assigning that obligation to the right person, and reconciling it with the existing board. This eval isolates that capability with a small, reproducible setup.</w:t>
+        <w:t>The verification design deliberately treats deterministic state checking as authoritative. Success is objective here: either the task board contains the required commitments with the correct owners and no spurious work, or it does not. That makes deterministic reward more appropriate than a judge-only approach.</w:t>
+      </w:r>
+    </w:p>
+    <w:p>
+      <w:pPr>
+        <w:spacing w:after="120" w:line="264" w:lineRule="auto"/>
+      </w:pPr>
+      <w:r>
+        <w:t>The LLM judge remains useful as a comparison signal but is too permissive to drive reward. In the failing 26B trial, gpt-4o-mini scored the run 1.0 and claimed all commitments were tracked even though billing API monitoring was missing. That false pass is exactly why the deterministic verifier is the sole reward.</w:t>
+      </w:r>
+    </w:p>
+    <w:p>
+      <w:pPr>
+        <w:spacing w:after="120" w:line="264" w:lineRule="auto"/>
+      </w:pPr>
+      <w:r>
+        <w:t>The calibration arc also matters. The initial design saturated at 100% for both tested Gemma models. We hardened it with decoys plus implicit and threaded commitments, which made the task unsaturated for the target model and discriminating against the stronger comparison. During calibration, two unfair-verifier bugs were caught and fixed: an exact-match false negative on staging key rotation and a cancellation check that inverted model ranking. Those fixes illustrate the unfair-verifier risk called out in the brief and are part of making the final result trustworthy.</w:t>
+      </w:r>
+    </w:p>
+    <w:p>
+      <w:pPr>
+        <w:spacing w:after="120" w:line="264" w:lineRule="auto"/>
+      </w:pPr>
+      <w:r>
+        <w:t>Harbor framing: the submitted task includes instruction.md, a Dockerized environment with Slack and Task Manager CLIs, a deterministic verifier that writes reward.json, and an oracle solution. The recorded runs were executed with harbor run using terminus-2 and Gemma models through OpenRouter.</w:t>
       </w:r>
     </w:p>
     <w:sectPr>
       <w:pgSz w:w="12240" w:h="15840"/>
-      <w:pgMar w:top="1152" w:right="1224" w:bottom="1152" w:left="1224" w:header="720" w:footer="720" w:gutter="0"/>
+      <w:pgMar w:top="1440" w:right="1440" w:bottom="1440" w:left="1440" w:header="720" w:footer="720" w:gutter="0"/>
       <w:cols w:space="720"/>
       <w:docGrid w:linePitch="360"/>
     </w:sectPr>
@@ -752,9 +675,12 @@
     <w:name w:val="Normal"/>
     <w:qFormat/>
     <w:rsid w:val="00FC693F"/>
+    <w:pPr>
+      <w:spacing w:after="120" w:line="264" w:lineRule="auto"/>
+    </w:pPr>
     <w:rPr>
-      <w:rFonts w:ascii="Arial" w:hAnsi="Arial"/>
-      <w:sz w:val="21"/>
+      <w:rFonts w:ascii="Calibri" w:hAnsi="Calibri"/>
+      <w:sz w:val="22"/>
     </w:rPr>
   </w:style>
   <w:style w:type="paragraph" w:styleId="Header">
@@ -816,10 +742,10 @@
       <w:outlineLvl w:val="0"/>
     </w:pPr>
     <w:rPr>
-      <w:rFonts w:asciiTheme="majorHAnsi" w:eastAsiaTheme="majorEastAsia" w:hAnsiTheme="majorHAnsi" w:cstheme="majorBidi" w:ascii="Arial" w:hAnsi="Arial"/>
+      <w:rFonts w:asciiTheme="majorHAnsi" w:eastAsiaTheme="majorEastAsia" w:hAnsiTheme="majorHAnsi" w:cstheme="majorBidi" w:ascii="Calibri" w:hAnsi="Calibri"/>
       <w:b/>
       <w:bCs/>
-      <w:color w:val="1F4E79"/>
+      <w:color w:val="2E74B5"/>
       <w:sz w:val="32"/>
       <w:szCs w:val="28"/>
     </w:rPr>
@@ -840,11 +766,11 @@
       <w:outlineLvl w:val="1"/>
     </w:pPr>
     <w:rPr>
-      <w:rFonts w:asciiTheme="majorHAnsi" w:eastAsiaTheme="majorEastAsia" w:hAnsiTheme="majorHAnsi" w:cstheme="majorBidi" w:ascii="Arial" w:hAnsi="Arial"/>
+      <w:rFonts w:asciiTheme="majorHAnsi" w:eastAsiaTheme="majorEastAsia" w:hAnsiTheme="majorHAnsi" w:cstheme="majorBidi" w:ascii="Calibri" w:hAnsi="Calibri"/>
       <w:b/>
       <w:bCs/>
-      <w:color w:val="1F4E79"/>
-      <w:sz w:val="25"/>
+      <w:color w:val="2E74B5"/>
+      <w:sz w:val="26"/>
       <w:szCs w:val="26"/>
     </w:rPr>
   </w:style>
@@ -864,11 +790,11 @@
       <w:outlineLvl w:val="2"/>
     </w:pPr>
     <w:rPr>
-      <w:rFonts w:asciiTheme="majorHAnsi" w:eastAsiaTheme="majorEastAsia" w:hAnsiTheme="majorHAnsi" w:cstheme="majorBidi" w:ascii="Arial" w:hAnsi="Arial"/>
+      <w:rFonts w:asciiTheme="majorHAnsi" w:eastAsiaTheme="majorEastAsia" w:hAnsiTheme="majorHAnsi" w:cstheme="majorBidi" w:ascii="Calibri" w:hAnsi="Calibri"/>
       <w:b/>
       <w:bCs/>
-      <w:color w:val="404040"/>
-      <w:sz w:val="22"/>
+      <w:color w:val="1F4D78"/>
+      <w:sz w:val="24"/>
     </w:rPr>
   </w:style>
   <w:style w:type="paragraph" w:styleId="Heading4">

</xml_diff>